<commit_message>
Update completed date in project documentation to reflect new timeline
</commit_message>
<xml_diff>
--- a/iuh/môn/da-phuong-tien/lab4/IMAGES_VIDEOS_NANGCAO-t2/23630851_Lê Thành Long_lab4-2.docx
+++ b/iuh/môn/da-phuong-tien/lab4/IMAGES_VIDEOS_NANGCAO-t2/23630851_Lê Thành Long_lab4-2.docx
@@ -1,6 +1,6 @@
 
 <file path=word/document.xml><?xml version="1.0" encoding="utf-8"?>
-<w:document xmlns:wpc="http://schemas.microsoft.com/office/word/2010/wordprocessingCanvas" xmlns:cx="http://schemas.microsoft.com/office/drawing/2014/chartex" xmlns:cx1="http://schemas.microsoft.com/office/drawing/2015/9/8/chartex" xmlns:cx2="http://schemas.microsoft.com/office/drawing/2015/10/21/chartex" xmlns:cx3="http://schemas.microsoft.com/office/drawing/2016/5/9/chartex" xmlns:cx4="http://schemas.microsoft.com/office/drawing/2016/5/10/chartex" xmlns:cx5="http://schemas.microsoft.com/office/drawing/2016/5/11/chartex" xmlns:cx6="http://schemas.microsoft.com/office/drawing/2016/5/12/chartex" xmlns:cx7="http://schemas.microsoft.com/office/drawing/2016/5/13/chartex" xmlns:cx8="http://schemas.microsoft.com/office/drawing/2016/5/14/chartex" xmlns:mc="http://schemas.openxmlformats.org/markup-compatibility/2006" xmlns:aink="http://schemas.microsoft.com/office/drawing/2016/ink" xmlns:am3d="http://schemas.microsoft.com/office/drawing/2017/model3d" xmlns:o="urn:schemas-microsoft-com:office:office" xmlns:oel="http://schemas.microsoft.com/office/2019/extlst" xmlns:r="http://schemas.openxmlformats.org/officeDocument/2006/relationships" xmlns:m="http://schemas.openxmlformats.org/officeDocument/2006/math" xmlns:v="urn:schemas-microsoft-com:vml" xmlns:wp14="http://schemas.microsoft.com/office/word/2010/wordprocessingDrawing" xmlns:wp="http://schemas.openxmlformats.org/drawingml/2006/wordprocessingDrawing" xmlns:w10="urn:schemas-microsoft-com:office:word" xmlns:w="http://schemas.openxmlformats.org/wordprocessingml/2006/main" xmlns:w14="http://schemas.microsoft.com/office/word/2010/wordml" xmlns:w15="http://schemas.microsoft.com/office/word/2012/wordml" xmlns:w16cex="http://schemas.microsoft.com/office/word/2018/wordml/cex" xmlns:w16cid="http://schemas.microsoft.com/office/word/2016/wordml/cid" xmlns:w16="http://schemas.microsoft.com/office/word/2018/wordml" xmlns:w16du="http://schemas.microsoft.com/office/word/2023/wordml/word16du" xmlns:w16sdtdh="http://schemas.microsoft.com/office/word/2020/wordml/sdtdatahash" xmlns:w16sdtfl="http://schemas.microsoft.com/office/word/2024/wordml/sdtformatlock" xmlns:w16se="http://schemas.microsoft.com/office/word/2015/wordml/symex" xmlns:wpg="http://schemas.microsoft.com/office/word/2010/wordprocessingGroup" xmlns:wpi="http://schemas.microsoft.com/office/word/2010/wordprocessingInk" xmlns:wne="http://schemas.microsoft.com/office/word/2006/wordml" xmlns:wps="http://schemas.microsoft.com/office/word/2010/wordprocessingShape" mc:Ignorable="w14 w15 w16se w16cid w16 w16cex w16sdtdh w16sdtfl w16du wp14">
+<w:document xmlns:wpc="http://schemas.microsoft.com/office/word/2010/wordprocessingCanvas" xmlns:mc="http://schemas.openxmlformats.org/markup-compatibility/2006" xmlns:o="urn:schemas-microsoft-com:office:office" xmlns:r="http://schemas.openxmlformats.org/officeDocument/2006/relationships" xmlns:m="http://schemas.openxmlformats.org/officeDocument/2006/math" xmlns:v="urn:schemas-microsoft-com:vml" xmlns:wp14="http://schemas.microsoft.com/office/word/2010/wordprocessingDrawing" xmlns:wp="http://schemas.openxmlformats.org/drawingml/2006/wordprocessingDrawing" xmlns:w10="urn:schemas-microsoft-com:office:word" xmlns:w="http://schemas.openxmlformats.org/wordprocessingml/2006/main" xmlns:w14="http://schemas.microsoft.com/office/word/2010/wordml" xmlns:w15="http://schemas.microsoft.com/office/word/2012/wordml" xmlns:wpg="http://schemas.microsoft.com/office/word/2010/wordprocessingGroup" xmlns:wpi="http://schemas.microsoft.com/office/word/2010/wordprocessingInk" xmlns:wne="http://schemas.microsoft.com/office/word/2006/wordml" xmlns:wps="http://schemas.microsoft.com/office/word/2010/wordprocessingShape" mc:Ignorable="w14 w15 wp14">
   <w:body>
     <w:p>
       <w:pPr>
@@ -134,28 +134,69 @@
           <w:sz w:val="28"/>
         </w:rPr>
       </w:pPr>
+      <w:proofErr w:type="spellStart"/>
       <w:r>
         <w:rPr>
           <w:b/>
           <w:sz w:val="28"/>
         </w:rPr>
-        <w:t xml:space="preserve">Khoa: Công </w:t>
-      </w:r>
-      <w:proofErr w:type="spellStart"/>
+        <w:t>Khoa</w:t>
+      </w:r>
+      <w:proofErr w:type="spellEnd"/>
       <w:r>
         <w:rPr>
           <w:b/>
           <w:sz w:val="28"/>
         </w:rPr>
-        <w:t>Nghệ</w:t>
-      </w:r>
-      <w:proofErr w:type="spellEnd"/>
+        <w:t xml:space="preserve">: </w:t>
+      </w:r>
+      <w:proofErr w:type="spellStart"/>
       <w:r>
         <w:rPr>
           <w:b/>
           <w:sz w:val="28"/>
         </w:rPr>
-        <w:t xml:space="preserve"> Thông Tin</w:t>
+        <w:t>Công</w:t>
+      </w:r>
+      <w:proofErr w:type="spellEnd"/>
+      <w:r>
+        <w:rPr>
+          <w:b/>
+          <w:sz w:val="28"/>
+        </w:rPr>
+        <w:t xml:space="preserve"> </w:t>
+      </w:r>
+      <w:proofErr w:type="spellStart"/>
+      <w:r>
+        <w:rPr>
+          <w:b/>
+          <w:sz w:val="28"/>
+        </w:rPr>
+        <w:t>Nghệ</w:t>
+      </w:r>
+      <w:proofErr w:type="spellEnd"/>
+      <w:r>
+        <w:rPr>
+          <w:b/>
+          <w:sz w:val="28"/>
+        </w:rPr>
+        <w:t xml:space="preserve"> </w:t>
+      </w:r>
+      <w:proofErr w:type="spellStart"/>
+      <w:r>
+        <w:rPr>
+          <w:b/>
+          <w:sz w:val="28"/>
+        </w:rPr>
+        <w:t>Thông</w:t>
+      </w:r>
+      <w:proofErr w:type="spellEnd"/>
+      <w:r>
+        <w:rPr>
+          <w:b/>
+          <w:sz w:val="28"/>
+        </w:rPr>
+        <w:t xml:space="preserve"> Tin</w:t>
       </w:r>
     </w:p>
     <w:p>
@@ -506,6 +547,7 @@
           <w:sz w:val="44"/>
           <w:szCs w:val="44"/>
         </w:rPr>
+        <w:lastRenderedPageBreak/>
         <w:t>Student’s ID</w:t>
       </w:r>
       <w:r>
@@ -520,30 +562,14 @@
           <w:sz w:val="44"/>
           <w:szCs w:val="44"/>
         </w:rPr>
-        <w:t xml:space="preserve">    </w:t>
-      </w:r>
-      <w:proofErr w:type="gramStart"/>
-      <w:r>
-        <w:rPr>
-          <w:sz w:val="44"/>
-          <w:szCs w:val="44"/>
-        </w:rPr>
-        <w:t xml:space="preserve">  </w:t>
-      </w:r>
-      <w:r>
-        <w:rPr>
-          <w:sz w:val="44"/>
-          <w:szCs w:val="44"/>
-        </w:rPr>
-        <w:t>:</w:t>
-      </w:r>
-      <w:proofErr w:type="gramEnd"/>
-      <w:r>
-        <w:rPr>
-          <w:sz w:val="44"/>
-          <w:szCs w:val="44"/>
-        </w:rPr>
-        <w:t xml:space="preserve">  </w:t>
+        <w:t xml:space="preserve">      </w:t>
+      </w:r>
+      <w:r>
+        <w:rPr>
+          <w:sz w:val="44"/>
+          <w:szCs w:val="44"/>
+        </w:rPr>
+        <w:t xml:space="preserve">:  </w:t>
       </w:r>
       <w:r>
         <w:rPr>
@@ -570,30 +596,14 @@
           <w:sz w:val="44"/>
           <w:szCs w:val="44"/>
         </w:rPr>
-        <w:t xml:space="preserve">Student’s name  </w:t>
-      </w:r>
-      <w:proofErr w:type="gramStart"/>
-      <w:r>
-        <w:rPr>
-          <w:sz w:val="44"/>
-          <w:szCs w:val="44"/>
-        </w:rPr>
-        <w:t xml:space="preserve">  </w:t>
-      </w:r>
-      <w:r>
-        <w:rPr>
-          <w:sz w:val="44"/>
-          <w:szCs w:val="44"/>
-        </w:rPr>
-        <w:t>:</w:t>
-      </w:r>
-      <w:proofErr w:type="gramEnd"/>
-      <w:r>
-        <w:rPr>
-          <w:sz w:val="44"/>
-          <w:szCs w:val="44"/>
-        </w:rPr>
-        <w:t xml:space="preserve">  </w:t>
+        <w:t xml:space="preserve">Student’s name    </w:t>
+      </w:r>
+      <w:r>
+        <w:rPr>
+          <w:sz w:val="44"/>
+          <w:szCs w:val="44"/>
+        </w:rPr>
+        <w:t xml:space="preserve">:  </w:t>
       </w:r>
       <w:r>
         <w:rPr>
@@ -636,7 +646,6 @@
         </w:rPr>
         <w:tab/>
       </w:r>
-      <w:proofErr w:type="gramStart"/>
       <w:r>
         <w:rPr>
           <w:sz w:val="44"/>
@@ -665,7 +674,6 @@
         </w:rPr>
         <w:t>PTHTDPT</w:t>
       </w:r>
-      <w:proofErr w:type="gramEnd"/>
     </w:p>
     <w:p>
       <w:pPr>
@@ -699,6 +707,8 @@
         </w:rPr>
         <w:tab/>
       </w:r>
+      <w:bookmarkStart w:id="0" w:name="_GoBack"/>
+      <w:bookmarkEnd w:id="0"/>
       <w:r>
         <w:rPr>
           <w:sz w:val="44"/>
@@ -749,47 +759,6 @@
           <w:szCs w:val="44"/>
         </w:rPr>
         <w:tab/>
-      </w:r>
-      <w:r>
-        <w:rPr>
-          <w:sz w:val="44"/>
-          <w:szCs w:val="44"/>
-        </w:rPr>
-        <w:tab/>
-        <w:t xml:space="preserve">:  Công </w:t>
-      </w:r>
-      <w:proofErr w:type="spellStart"/>
-      <w:r>
-        <w:rPr>
-          <w:sz w:val="44"/>
-          <w:szCs w:val="44"/>
-        </w:rPr>
-        <w:t>Nghệ</w:t>
-      </w:r>
-      <w:proofErr w:type="spellEnd"/>
-      <w:r>
-        <w:rPr>
-          <w:sz w:val="44"/>
-          <w:szCs w:val="44"/>
-        </w:rPr>
-        <w:t xml:space="preserve"> Thông Tin                         </w:t>
-      </w:r>
-    </w:p>
-    <w:p>
-      <w:pPr>
-        <w:ind w:firstLine="360"/>
-        <w:rPr>
-          <w:sz w:val="44"/>
-          <w:szCs w:val="44"/>
-          <w:lang w:val="vi-VN"/>
-        </w:rPr>
-      </w:pPr>
-      <w:r>
-        <w:rPr>
-          <w:sz w:val="44"/>
-          <w:szCs w:val="44"/>
-        </w:rPr>
-        <w:t>Completed Date</w:t>
       </w:r>
       <w:r>
         <w:rPr>
@@ -799,26 +768,85 @@
         <w:tab/>
         <w:t xml:space="preserve">:  </w:t>
       </w:r>
-      <w:r>
-        <w:rPr>
-          <w:sz w:val="44"/>
-          <w:szCs w:val="44"/>
-        </w:rPr>
-        <w:t xml:space="preserve"> 09</w:t>
-      </w:r>
-      <w:r>
-        <w:rPr>
-          <w:sz w:val="44"/>
-          <w:szCs w:val="44"/>
-        </w:rPr>
-        <w:t>/</w:t>
-      </w:r>
-      <w:r>
-        <w:rPr>
-          <w:sz w:val="44"/>
-          <w:szCs w:val="44"/>
-        </w:rPr>
-        <w:t>24</w:t>
+      <w:proofErr w:type="spellStart"/>
+      <w:r>
+        <w:rPr>
+          <w:sz w:val="44"/>
+          <w:szCs w:val="44"/>
+        </w:rPr>
+        <w:t>Công</w:t>
+      </w:r>
+      <w:proofErr w:type="spellEnd"/>
+      <w:r>
+        <w:rPr>
+          <w:sz w:val="44"/>
+          <w:szCs w:val="44"/>
+        </w:rPr>
+        <w:t xml:space="preserve"> </w:t>
+      </w:r>
+      <w:proofErr w:type="spellStart"/>
+      <w:r>
+        <w:rPr>
+          <w:sz w:val="44"/>
+          <w:szCs w:val="44"/>
+        </w:rPr>
+        <w:t>Nghệ</w:t>
+      </w:r>
+      <w:proofErr w:type="spellEnd"/>
+      <w:r>
+        <w:rPr>
+          <w:sz w:val="44"/>
+          <w:szCs w:val="44"/>
+        </w:rPr>
+        <w:t xml:space="preserve"> </w:t>
+      </w:r>
+      <w:proofErr w:type="spellStart"/>
+      <w:r>
+        <w:rPr>
+          <w:sz w:val="44"/>
+          <w:szCs w:val="44"/>
+        </w:rPr>
+        <w:t>Thông</w:t>
+      </w:r>
+      <w:proofErr w:type="spellEnd"/>
+      <w:r>
+        <w:rPr>
+          <w:sz w:val="44"/>
+          <w:szCs w:val="44"/>
+        </w:rPr>
+        <w:t xml:space="preserve"> Tin                         </w:t>
+      </w:r>
+    </w:p>
+    <w:p>
+      <w:pPr>
+        <w:ind w:firstLine="360"/>
+        <w:rPr>
+          <w:sz w:val="44"/>
+          <w:szCs w:val="44"/>
+          <w:lang w:val="vi-VN"/>
+        </w:rPr>
+      </w:pPr>
+      <w:r>
+        <w:rPr>
+          <w:sz w:val="44"/>
+          <w:szCs w:val="44"/>
+        </w:rPr>
+        <w:t>Completed Date</w:t>
+      </w:r>
+      <w:r>
+        <w:rPr>
+          <w:sz w:val="44"/>
+          <w:szCs w:val="44"/>
+        </w:rPr>
+        <w:tab/>
+        <w:t xml:space="preserve">:  </w:t>
+      </w:r>
+      <w:r>
+        <w:rPr>
+          <w:sz w:val="44"/>
+          <w:szCs w:val="44"/>
+        </w:rPr>
+        <w:t xml:space="preserve"> 10/01</w:t>
       </w:r>
       <w:r>
         <w:rPr>
@@ -1028,6 +1056,7 @@
         <w:ind w:firstLine="450"/>
       </w:pPr>
       <w:r>
+        <w:lastRenderedPageBreak/>
         <w:tab/>
       </w:r>
     </w:p>
@@ -1259,7 +1288,15 @@
     </w:p>
     <w:p>
       <w:r>
-        <w:t xml:space="preserve">• Hiển </w:t>
+        <w:t xml:space="preserve">• </w:t>
+      </w:r>
+      <w:proofErr w:type="spellStart"/>
+      <w:r>
+        <w:t>Hiển</w:t>
+      </w:r>
+      <w:proofErr w:type="spellEnd"/>
+      <w:r>
+        <w:t xml:space="preserve"> </w:t>
       </w:r>
       <w:proofErr w:type="spellStart"/>
       <w:r>
@@ -1477,27 +1514,25 @@
         <w:t xml:space="preserve"> </w:t>
       </w:r>
       <w:proofErr w:type="spellStart"/>
+      <w:r>
+        <w:t>PIL.Image.open</w:t>
+      </w:r>
+      <w:proofErr w:type="spellEnd"/>
+      <w:r>
+        <w:t xml:space="preserve">, </w:t>
+      </w:r>
+      <w:proofErr w:type="spellStart"/>
       <w:proofErr w:type="gramStart"/>
       <w:r>
-        <w:t>PIL.Image.open</w:t>
-      </w:r>
-      <w:proofErr w:type="spellEnd"/>
+        <w:t>np.array</w:t>
+      </w:r>
+      <w:proofErr w:type="spellEnd"/>
+      <w:r>
+        <w:t>(</w:t>
+      </w:r>
+      <w:proofErr w:type="spellStart"/>
       <w:proofErr w:type="gramEnd"/>
       <w:r>
-        <w:t xml:space="preserve">, </w:t>
-      </w:r>
-      <w:proofErr w:type="spellStart"/>
-      <w:proofErr w:type="gramStart"/>
-      <w:r>
-        <w:t>np.array</w:t>
-      </w:r>
-      <w:proofErr w:type="spellEnd"/>
-      <w:proofErr w:type="gramEnd"/>
-      <w:r>
-        <w:t>(</w:t>
-      </w:r>
-      <w:proofErr w:type="spellStart"/>
-      <w:r>
         <w:t>img</w:t>
       </w:r>
       <w:proofErr w:type="spellEnd"/>
@@ -1505,12 +1540,10 @@
         <w:t xml:space="preserve">), </w:t>
       </w:r>
       <w:proofErr w:type="spellStart"/>
-      <w:proofErr w:type="gramStart"/>
       <w:r>
         <w:t>img.getexif</w:t>
       </w:r>
       <w:proofErr w:type="spellEnd"/>
-      <w:proofErr w:type="gramEnd"/>
       <w:r>
         <w:t>().</w:t>
       </w:r>
@@ -1557,7 +1590,15 @@
       </w:r>
       <w:proofErr w:type="spellEnd"/>
       <w:r>
-        <w:t>/mov/</w:t>
+        <w:t>/</w:t>
+      </w:r>
+      <w:proofErr w:type="spellStart"/>
+      <w:r>
+        <w:t>mov</w:t>
+      </w:r>
+      <w:proofErr w:type="spellEnd"/>
+      <w:r>
+        <w:t>/</w:t>
       </w:r>
       <w:proofErr w:type="spellStart"/>
       <w:r>
@@ -1570,7 +1611,15 @@
     </w:p>
     <w:p>
       <w:r>
-        <w:t xml:space="preserve">• Hiển </w:t>
+        <w:t xml:space="preserve">• </w:t>
+      </w:r>
+      <w:proofErr w:type="spellStart"/>
+      <w:r>
+        <w:t>Hiển</w:t>
+      </w:r>
+      <w:proofErr w:type="spellEnd"/>
+      <w:r>
+        <w:t xml:space="preserve"> </w:t>
       </w:r>
       <w:proofErr w:type="spellStart"/>
       <w:r>
@@ -1671,7 +1720,15 @@
     </w:p>
     <w:p>
       <w:r>
-        <w:t xml:space="preserve">• Hiển </w:t>
+        <w:t xml:space="preserve">• </w:t>
+      </w:r>
+      <w:proofErr w:type="spellStart"/>
+      <w:r>
+        <w:t>Hiển</w:t>
+      </w:r>
+      <w:proofErr w:type="spellEnd"/>
+      <w:r>
+        <w:t xml:space="preserve"> </w:t>
       </w:r>
       <w:proofErr w:type="spellStart"/>
       <w:r>
@@ -1709,6 +1766,7 @@
     <w:p>
       <w:proofErr w:type="spellStart"/>
       <w:r>
+        <w:lastRenderedPageBreak/>
         <w:t>Gợi</w:t>
       </w:r>
       <w:proofErr w:type="spellEnd"/>
@@ -1966,8 +2024,9 @@
       </w:pPr>
       <w:r>
         <w:rPr>
-          <w:lang w:val="vi-VN"/>
-        </w:rPr>
+          <w:noProof/>
+        </w:rPr>
+        <w:lastRenderedPageBreak/>
         <w:drawing>
           <wp:inline distT="0" distB="0" distL="0" distR="0" wp14:anchorId="065DC683" wp14:editId="381DCAA2">
             <wp:extent cx="12001500" cy="7048500"/>
@@ -2015,6 +2074,7 @@
         <w:rPr>
           <w:noProof/>
         </w:rPr>
+        <w:lastRenderedPageBreak/>
         <w:drawing>
           <wp:inline distT="0" distB="0" distL="0" distR="0" wp14:anchorId="0DC6B855" wp14:editId="49C054E1">
             <wp:extent cx="10514286" cy="6038095"/>
@@ -2062,6 +2122,7 @@
         <w:rPr>
           <w:noProof/>
         </w:rPr>
+        <w:lastRenderedPageBreak/>
         <w:drawing>
           <wp:inline distT="0" distB="0" distL="0" distR="0" wp14:anchorId="2F464514" wp14:editId="560D841E">
             <wp:extent cx="10838095" cy="6609524"/>
@@ -2116,16 +2177,8 @@
         <w:rPr>
           <w:lang w:val="vi-VN"/>
         </w:rPr>
-        <w:t xml:space="preserve"> Ghi chú các thuộc tính quan trọng trong xử lý ảnh và </w:t>
-      </w:r>
-      <w:proofErr w:type="spellStart"/>
-      <w:r>
-        <w:rPr>
-          <w:lang w:val="vi-VN"/>
-        </w:rPr>
-        <w:t>video</w:t>
-      </w:r>
-      <w:proofErr w:type="spellEnd"/>
+        <w:t xml:space="preserve"> Ghi chú các thuộc tính quan trọng trong xử lý ảnh và video</w:t>
+      </w:r>
     </w:p>
     <w:p>
       <w:pPr>
@@ -2157,654 +2210,191 @@
         <w:rPr>
           <w:lang w:val="vi-VN"/>
         </w:rPr>
-        <w:t xml:space="preserve">- </w:t>
-      </w:r>
-      <w:proofErr w:type="spellStart"/>
-      <w:r>
-        <w:rPr>
-          <w:lang w:val="vi-VN"/>
-        </w:rPr>
-        <w:t>format</w:t>
-      </w:r>
-      <w:proofErr w:type="spellEnd"/>
-      <w:r>
-        <w:rPr>
-          <w:lang w:val="vi-VN"/>
-        </w:rPr>
-        <w:t xml:space="preserve">: Định dạng </w:t>
-      </w:r>
-      <w:proofErr w:type="spellStart"/>
-      <w:r>
-        <w:rPr>
-          <w:lang w:val="vi-VN"/>
-        </w:rPr>
-        <w:t>file</w:t>
-      </w:r>
-      <w:proofErr w:type="spellEnd"/>
-      <w:r>
-        <w:rPr>
-          <w:lang w:val="vi-VN"/>
-        </w:rPr>
-        <w:t xml:space="preserve"> ảnh (PNG, JPEG, TIFF...) - ảnh hưởng đến chất lượng và nén</w:t>
-      </w:r>
-    </w:p>
-    <w:p>
-      <w:pPr>
-        <w:rPr>
-          <w:lang w:val="vi-VN"/>
-        </w:rPr>
-      </w:pPr>
-      <w:r>
-        <w:rPr>
-          <w:lang w:val="vi-VN"/>
-        </w:rPr>
-        <w:t xml:space="preserve">- </w:t>
-      </w:r>
-      <w:proofErr w:type="spellStart"/>
-      <w:r>
-        <w:rPr>
-          <w:lang w:val="vi-VN"/>
-        </w:rPr>
-        <w:t>mode</w:t>
-      </w:r>
-      <w:proofErr w:type="spellEnd"/>
-      <w:r>
-        <w:rPr>
-          <w:lang w:val="vi-VN"/>
-        </w:rPr>
-        <w:t>: Chế độ màu (L=</w:t>
-      </w:r>
-      <w:proofErr w:type="spellStart"/>
-      <w:r>
-        <w:rPr>
-          <w:lang w:val="vi-VN"/>
-        </w:rPr>
-        <w:t>grayscale</w:t>
-      </w:r>
-      <w:proofErr w:type="spellEnd"/>
-      <w:r>
-        <w:rPr>
-          <w:lang w:val="vi-VN"/>
-        </w:rPr>
-        <w:t xml:space="preserve">, RGB=màu, RGBA=có </w:t>
-      </w:r>
-      <w:proofErr w:type="spellStart"/>
-      <w:r>
-        <w:rPr>
-          <w:lang w:val="vi-VN"/>
-        </w:rPr>
-        <w:t>alpha</w:t>
-      </w:r>
-      <w:proofErr w:type="spellEnd"/>
-      <w:r>
-        <w:rPr>
-          <w:lang w:val="vi-VN"/>
-        </w:rPr>
-        <w:t>/trong suốt)</w:t>
-      </w:r>
-    </w:p>
-    <w:p>
-      <w:pPr>
-        <w:rPr>
-          <w:lang w:val="vi-VN"/>
-        </w:rPr>
-      </w:pPr>
-      <w:r>
-        <w:rPr>
-          <w:lang w:val="vi-VN"/>
-        </w:rPr>
-        <w:t xml:space="preserve">- </w:t>
-      </w:r>
-      <w:proofErr w:type="spellStart"/>
-      <w:r>
-        <w:rPr>
-          <w:lang w:val="vi-VN"/>
-        </w:rPr>
-        <w:t>size</w:t>
-      </w:r>
-      <w:proofErr w:type="spellEnd"/>
-      <w:r>
-        <w:rPr>
-          <w:lang w:val="vi-VN"/>
-        </w:rPr>
-        <w:t xml:space="preserve"> (</w:t>
-      </w:r>
-      <w:proofErr w:type="spellStart"/>
-      <w:r>
-        <w:rPr>
-          <w:lang w:val="vi-VN"/>
-        </w:rPr>
-        <w:t>width</w:t>
-      </w:r>
-      <w:proofErr w:type="spellEnd"/>
-      <w:r>
-        <w:rPr>
-          <w:lang w:val="vi-VN"/>
-        </w:rPr>
-        <w:t xml:space="preserve"> × </w:t>
-      </w:r>
-      <w:proofErr w:type="spellStart"/>
-      <w:r>
-        <w:rPr>
-          <w:lang w:val="vi-VN"/>
-        </w:rPr>
-        <w:t>height</w:t>
-      </w:r>
-      <w:proofErr w:type="spellEnd"/>
-      <w:r>
-        <w:rPr>
-          <w:lang w:val="vi-VN"/>
-        </w:rPr>
-        <w:t xml:space="preserve">): Độ phân giải ảnh tính bằng </w:t>
-      </w:r>
-      <w:proofErr w:type="spellStart"/>
-      <w:r>
-        <w:rPr>
-          <w:lang w:val="vi-VN"/>
-        </w:rPr>
-        <w:t>pixel</w:t>
-      </w:r>
-      <w:proofErr w:type="spellEnd"/>
-    </w:p>
-    <w:p>
-      <w:pPr>
-        <w:rPr>
-          <w:lang w:val="vi-VN"/>
-        </w:rPr>
-      </w:pPr>
-      <w:r>
-        <w:rPr>
-          <w:lang w:val="vi-VN"/>
-        </w:rPr>
-        <w:t xml:space="preserve">- </w:t>
-      </w:r>
-      <w:proofErr w:type="spellStart"/>
-      <w:r>
-        <w:rPr>
-          <w:lang w:val="vi-VN"/>
-        </w:rPr>
-        <w:t>channels</w:t>
-      </w:r>
-      <w:proofErr w:type="spellEnd"/>
-      <w:r>
-        <w:rPr>
-          <w:lang w:val="vi-VN"/>
-        </w:rPr>
-        <w:t>: Số kênh màu (1=xám, 3=RGB, 4=RGBA)</w:t>
-      </w:r>
-    </w:p>
-    <w:p>
-      <w:pPr>
-        <w:rPr>
-          <w:lang w:val="vi-VN"/>
-        </w:rPr>
-      </w:pPr>
-      <w:r>
-        <w:rPr>
-          <w:lang w:val="vi-VN"/>
-        </w:rPr>
-        <w:t xml:space="preserve">- </w:t>
-      </w:r>
-      <w:proofErr w:type="spellStart"/>
-      <w:r>
-        <w:rPr>
-          <w:lang w:val="vi-VN"/>
-        </w:rPr>
-        <w:t>bit_depth_per_channel</w:t>
-      </w:r>
-      <w:proofErr w:type="spellEnd"/>
-      <w:r>
-        <w:rPr>
-          <w:lang w:val="vi-VN"/>
-        </w:rPr>
-        <w:t xml:space="preserve">: Số </w:t>
-      </w:r>
-      <w:proofErr w:type="spellStart"/>
-      <w:r>
-        <w:rPr>
-          <w:lang w:val="vi-VN"/>
-        </w:rPr>
-        <w:t>bit</w:t>
-      </w:r>
-      <w:proofErr w:type="spellEnd"/>
-      <w:r>
-        <w:rPr>
-          <w:lang w:val="vi-VN"/>
-        </w:rPr>
-        <w:t>/kênh (8-bit=256 mức, 16-bit=65536 mức) - quyết định độ chi tiết màu sắc</w:t>
-      </w:r>
-    </w:p>
-    <w:p>
-      <w:pPr>
-        <w:rPr>
-          <w:lang w:val="vi-VN"/>
-        </w:rPr>
-      </w:pPr>
-      <w:r>
-        <w:rPr>
-          <w:lang w:val="vi-VN"/>
-        </w:rPr>
-        <w:t xml:space="preserve">- EXIF: </w:t>
-      </w:r>
-      <w:proofErr w:type="spellStart"/>
-      <w:r>
-        <w:rPr>
-          <w:lang w:val="vi-VN"/>
-        </w:rPr>
-        <w:t>Metadata</w:t>
-      </w:r>
-      <w:proofErr w:type="spellEnd"/>
-      <w:r>
-        <w:rPr>
-          <w:lang w:val="vi-VN"/>
-        </w:rPr>
-        <w:t xml:space="preserve"> từ </w:t>
-      </w:r>
-      <w:proofErr w:type="spellStart"/>
-      <w:r>
-        <w:rPr>
-          <w:lang w:val="vi-VN"/>
-        </w:rPr>
-        <w:t>camera</w:t>
-      </w:r>
-      <w:proofErr w:type="spellEnd"/>
-      <w:r>
-        <w:rPr>
-          <w:lang w:val="vi-VN"/>
-        </w:rPr>
-        <w:t xml:space="preserve"> (thời gian chụp, thông số máy, GPS...)</w:t>
-      </w:r>
-    </w:p>
-    <w:p>
-      <w:pPr>
-        <w:rPr>
-          <w:lang w:val="vi-VN"/>
-        </w:rPr>
-      </w:pPr>
-    </w:p>
-    <w:p>
-      <w:pPr>
-        <w:rPr>
-          <w:lang w:val="vi-VN"/>
-        </w:rPr>
-      </w:pPr>
-      <w:r>
-        <w:rPr>
-          <w:lang w:val="vi-VN"/>
-        </w:rPr>
-        <w:t xml:space="preserve"> Thuộc tính </w:t>
-      </w:r>
-      <w:proofErr w:type="spellStart"/>
-      <w:r>
-        <w:rPr>
-          <w:lang w:val="vi-VN"/>
-        </w:rPr>
-        <w:t>video</w:t>
-      </w:r>
-      <w:proofErr w:type="spellEnd"/>
-      <w:r>
-        <w:rPr>
-          <w:lang w:val="vi-VN"/>
-        </w:rPr>
-        <w:t>:</w:t>
-      </w:r>
-    </w:p>
-    <w:p>
-      <w:pPr>
-        <w:rPr>
-          <w:lang w:val="vi-VN"/>
-        </w:rPr>
-      </w:pPr>
-      <w:r>
-        <w:rPr>
-          <w:lang w:val="vi-VN"/>
-        </w:rPr>
-        <w:t>- FPS (</w:t>
-      </w:r>
-      <w:proofErr w:type="spellStart"/>
-      <w:r>
-        <w:rPr>
-          <w:lang w:val="vi-VN"/>
-        </w:rPr>
-        <w:t>Frames</w:t>
-      </w:r>
-      <w:proofErr w:type="spellEnd"/>
-      <w:r>
-        <w:rPr>
-          <w:lang w:val="vi-VN"/>
-        </w:rPr>
-        <w:t xml:space="preserve"> </w:t>
-      </w:r>
-      <w:proofErr w:type="spellStart"/>
-      <w:r>
-        <w:rPr>
-          <w:lang w:val="vi-VN"/>
-        </w:rPr>
-        <w:t>Per</w:t>
-      </w:r>
-      <w:proofErr w:type="spellEnd"/>
-      <w:r>
-        <w:rPr>
-          <w:lang w:val="vi-VN"/>
-        </w:rPr>
-        <w:t xml:space="preserve"> </w:t>
-      </w:r>
-      <w:proofErr w:type="spellStart"/>
-      <w:r>
-        <w:rPr>
-          <w:lang w:val="vi-VN"/>
-        </w:rPr>
-        <w:t>Second</w:t>
-      </w:r>
-      <w:proofErr w:type="spellEnd"/>
-      <w:r>
-        <w:rPr>
-          <w:lang w:val="vi-VN"/>
-        </w:rPr>
-        <w:t xml:space="preserve">): Số khung hình/giây - quyết định độ mượt của </w:t>
-      </w:r>
-      <w:proofErr w:type="spellStart"/>
-      <w:r>
-        <w:rPr>
-          <w:lang w:val="vi-VN"/>
-        </w:rPr>
-        <w:t>video</w:t>
-      </w:r>
-      <w:proofErr w:type="spellEnd"/>
-      <w:r>
-        <w:rPr>
-          <w:lang w:val="vi-VN"/>
-        </w:rPr>
-        <w:t xml:space="preserve"> (24fps=phim, 30fps=TV, 60fps=</w:t>
-      </w:r>
-      <w:proofErr w:type="spellStart"/>
-      <w:r>
-        <w:rPr>
-          <w:lang w:val="vi-VN"/>
-        </w:rPr>
-        <w:t>game</w:t>
-      </w:r>
-      <w:proofErr w:type="spellEnd"/>
-      <w:r>
-        <w:rPr>
-          <w:lang w:val="vi-VN"/>
-        </w:rPr>
-        <w:t>)</w:t>
-      </w:r>
-    </w:p>
-    <w:p>
-      <w:pPr>
-        <w:rPr>
-          <w:lang w:val="vi-VN"/>
-        </w:rPr>
-      </w:pPr>
-      <w:r>
-        <w:rPr>
-          <w:lang w:val="vi-VN"/>
-        </w:rPr>
-        <w:t xml:space="preserve">- FOURCC: Mã 4 ký tự định danh </w:t>
-      </w:r>
-      <w:proofErr w:type="spellStart"/>
-      <w:r>
-        <w:rPr>
-          <w:lang w:val="vi-VN"/>
-        </w:rPr>
-        <w:t>codec</w:t>
-      </w:r>
-      <w:proofErr w:type="spellEnd"/>
-      <w:r>
-        <w:rPr>
-          <w:lang w:val="vi-VN"/>
-        </w:rPr>
-        <w:t xml:space="preserve"> nén </w:t>
-      </w:r>
-      <w:proofErr w:type="spellStart"/>
-      <w:r>
-        <w:rPr>
-          <w:lang w:val="vi-VN"/>
-        </w:rPr>
-        <w:t>video</w:t>
-      </w:r>
-      <w:proofErr w:type="spellEnd"/>
-      <w:r>
-        <w:rPr>
-          <w:lang w:val="vi-VN"/>
-        </w:rPr>
-        <w:t xml:space="preserve"> (H264, XVID, MP4V...)</w:t>
-      </w:r>
-    </w:p>
-    <w:p>
-      <w:pPr>
-        <w:rPr>
-          <w:lang w:val="vi-VN"/>
-        </w:rPr>
-      </w:pPr>
-      <w:r>
-        <w:rPr>
-          <w:lang w:val="vi-VN"/>
-        </w:rPr>
-        <w:t xml:space="preserve">- </w:t>
-      </w:r>
-      <w:proofErr w:type="spellStart"/>
-      <w:r>
-        <w:rPr>
-          <w:lang w:val="vi-VN"/>
-        </w:rPr>
-        <w:t>frame_count</w:t>
-      </w:r>
-      <w:proofErr w:type="spellEnd"/>
-      <w:r>
-        <w:rPr>
-          <w:lang w:val="vi-VN"/>
-        </w:rPr>
-        <w:t xml:space="preserve">: Tổng số khung hình trong </w:t>
-      </w:r>
-      <w:proofErr w:type="spellStart"/>
-      <w:r>
-        <w:rPr>
-          <w:lang w:val="vi-VN"/>
-        </w:rPr>
-        <w:t>video</w:t>
-      </w:r>
-      <w:proofErr w:type="spellEnd"/>
-    </w:p>
-    <w:p>
-      <w:pPr>
-        <w:rPr>
-          <w:lang w:val="vi-VN"/>
-        </w:rPr>
-      </w:pPr>
-      <w:r>
-        <w:rPr>
-          <w:lang w:val="vi-VN"/>
-        </w:rPr>
-        <w:t xml:space="preserve">- </w:t>
-      </w:r>
-      <w:proofErr w:type="spellStart"/>
-      <w:r>
-        <w:rPr>
-          <w:lang w:val="vi-VN"/>
-        </w:rPr>
-        <w:t>duration</w:t>
-      </w:r>
-      <w:proofErr w:type="spellEnd"/>
-      <w:r>
-        <w:rPr>
-          <w:lang w:val="vi-VN"/>
-        </w:rPr>
-        <w:t xml:space="preserve">: Thời lượng </w:t>
-      </w:r>
-      <w:proofErr w:type="spellStart"/>
-      <w:r>
-        <w:rPr>
-          <w:lang w:val="vi-VN"/>
-        </w:rPr>
-        <w:t>video</w:t>
-      </w:r>
-      <w:proofErr w:type="spellEnd"/>
-      <w:r>
-        <w:rPr>
-          <w:lang w:val="vi-VN"/>
-        </w:rPr>
-        <w:t xml:space="preserve"> (giây) = </w:t>
-      </w:r>
-      <w:proofErr w:type="spellStart"/>
-      <w:r>
-        <w:rPr>
-          <w:lang w:val="vi-VN"/>
-        </w:rPr>
-        <w:t>frame_count</w:t>
-      </w:r>
-      <w:proofErr w:type="spellEnd"/>
-      <w:r>
-        <w:rPr>
-          <w:lang w:val="vi-VN"/>
-        </w:rPr>
-        <w:t xml:space="preserve"> ÷ FPS</w:t>
-      </w:r>
-    </w:p>
-    <w:p>
-      <w:pPr>
-        <w:rPr>
-          <w:lang w:val="vi-VN"/>
-        </w:rPr>
-      </w:pPr>
-      <w:r>
-        <w:rPr>
-          <w:lang w:val="vi-VN"/>
-        </w:rPr>
-        <w:t xml:space="preserve">- </w:t>
-      </w:r>
-      <w:proofErr w:type="spellStart"/>
-      <w:r>
-        <w:rPr>
-          <w:lang w:val="vi-VN"/>
-        </w:rPr>
-        <w:t>bitrate</w:t>
-      </w:r>
-      <w:proofErr w:type="spellEnd"/>
-      <w:r>
-        <w:rPr>
-          <w:lang w:val="vi-VN"/>
-        </w:rPr>
-        <w:t>: Tốc độ dữ liệu (</w:t>
-      </w:r>
-      <w:proofErr w:type="spellStart"/>
-      <w:r>
-        <w:rPr>
-          <w:lang w:val="vi-VN"/>
-        </w:rPr>
-        <w:t>bit</w:t>
-      </w:r>
-      <w:proofErr w:type="spellEnd"/>
-      <w:r>
-        <w:rPr>
-          <w:lang w:val="vi-VN"/>
-        </w:rPr>
-        <w:t xml:space="preserve">/giây) - cao hơn = chất lượng tốt hơn nhưng </w:t>
-      </w:r>
-      <w:proofErr w:type="spellStart"/>
-      <w:r>
-        <w:rPr>
-          <w:lang w:val="vi-VN"/>
-        </w:rPr>
-        <w:t>file</w:t>
-      </w:r>
-      <w:proofErr w:type="spellEnd"/>
-      <w:r>
-        <w:rPr>
-          <w:lang w:val="vi-VN"/>
-        </w:rPr>
-        <w:t xml:space="preserve"> nặng hơn</w:t>
-      </w:r>
-    </w:p>
-    <w:p>
-      <w:pPr>
-        <w:rPr>
-          <w:lang w:val="vi-VN"/>
-        </w:rPr>
-      </w:pPr>
-      <w:r>
-        <w:rPr>
-          <w:lang w:val="vi-VN"/>
-        </w:rPr>
-        <w:t xml:space="preserve">- </w:t>
-      </w:r>
-      <w:proofErr w:type="spellStart"/>
-      <w:r>
-        <w:rPr>
-          <w:lang w:val="vi-VN"/>
-        </w:rPr>
-        <w:t>codec</w:t>
-      </w:r>
-      <w:proofErr w:type="spellEnd"/>
-      <w:r>
-        <w:rPr>
-          <w:lang w:val="vi-VN"/>
-        </w:rPr>
-        <w:t xml:space="preserve">: Thuật toán nén/giải nén </w:t>
-      </w:r>
-      <w:proofErr w:type="spellStart"/>
-      <w:r>
-        <w:rPr>
-          <w:lang w:val="vi-VN"/>
-        </w:rPr>
-        <w:t>video</w:t>
-      </w:r>
-      <w:proofErr w:type="spellEnd"/>
-      <w:r>
-        <w:rPr>
-          <w:lang w:val="vi-VN"/>
-        </w:rPr>
-        <w:t xml:space="preserve"> (H.264, H.265/HEVC...)</w:t>
-      </w:r>
-    </w:p>
-    <w:p>
-      <w:pPr>
-        <w:rPr>
-          <w:lang w:val="vi-VN"/>
-        </w:rPr>
-      </w:pPr>
-    </w:p>
-    <w:p>
-      <w:pPr>
-        <w:rPr>
-          <w:lang w:val="vi-VN"/>
-        </w:rPr>
-      </w:pPr>
-      <w:r>
-        <w:rPr>
-          <w:lang w:val="vi-VN"/>
-        </w:rPr>
-        <w:t xml:space="preserve">Lưu ý: Các thuộc tính này giúp tối ưu hóa xử lý, chọn </w:t>
-      </w:r>
-      <w:proofErr w:type="spellStart"/>
-      <w:r>
-        <w:rPr>
-          <w:lang w:val="vi-VN"/>
-        </w:rPr>
-        <w:t>format</w:t>
-      </w:r>
-      <w:proofErr w:type="spellEnd"/>
-      <w:r>
-        <w:rPr>
-          <w:lang w:val="vi-VN"/>
-        </w:rPr>
-        <w:t xml:space="preserve"> phù hợp và đánh giá chất lượng </w:t>
-      </w:r>
-      <w:proofErr w:type="spellStart"/>
-      <w:r>
-        <w:rPr>
-          <w:lang w:val="vi-VN"/>
-        </w:rPr>
-        <w:t>media</w:t>
-      </w:r>
-      <w:proofErr w:type="spellEnd"/>
-      <w:r>
-        <w:rPr>
-          <w:lang w:val="vi-VN"/>
-        </w:rPr>
-        <w:t>.</w:t>
+        <w:t>- format: Định dạng file ảnh (PNG, JPEG, TIFF...) - ảnh hưởng đến chất lượng và nén</w:t>
+      </w:r>
+    </w:p>
+    <w:p>
+      <w:pPr>
+        <w:rPr>
+          <w:lang w:val="vi-VN"/>
+        </w:rPr>
+      </w:pPr>
+      <w:r>
+        <w:rPr>
+          <w:lang w:val="vi-VN"/>
+        </w:rPr>
+        <w:lastRenderedPageBreak/>
+        <w:t>- mode: Chế độ màu (L=grayscale, RGB=màu, RGBA=có alpha/trong suốt)</w:t>
+      </w:r>
+    </w:p>
+    <w:p>
+      <w:pPr>
+        <w:rPr>
+          <w:lang w:val="vi-VN"/>
+        </w:rPr>
+      </w:pPr>
+      <w:r>
+        <w:rPr>
+          <w:lang w:val="vi-VN"/>
+        </w:rPr>
+        <w:t>- size (width × height): Độ phân giải ảnh tính bằng pixel</w:t>
+      </w:r>
+    </w:p>
+    <w:p>
+      <w:pPr>
+        <w:rPr>
+          <w:lang w:val="vi-VN"/>
+        </w:rPr>
+      </w:pPr>
+      <w:r>
+        <w:rPr>
+          <w:lang w:val="vi-VN"/>
+        </w:rPr>
+        <w:t>- channels: Số kênh màu (1=xám, 3=RGB, 4=RGBA)</w:t>
+      </w:r>
+    </w:p>
+    <w:p>
+      <w:pPr>
+        <w:rPr>
+          <w:lang w:val="vi-VN"/>
+        </w:rPr>
+      </w:pPr>
+      <w:r>
+        <w:rPr>
+          <w:lang w:val="vi-VN"/>
+        </w:rPr>
+        <w:t>- bit_depth_per_channel: Số bit/kênh (8-bit=256 mức, 16-bit=65536 mức) - quyết định độ chi tiết màu sắc</w:t>
+      </w:r>
+    </w:p>
+    <w:p>
+      <w:pPr>
+        <w:rPr>
+          <w:lang w:val="vi-VN"/>
+        </w:rPr>
+      </w:pPr>
+      <w:r>
+        <w:rPr>
+          <w:lang w:val="vi-VN"/>
+        </w:rPr>
+        <w:t>- EXIF: Metadata từ camera (thời gian chụp, thông số máy, GPS...)</w:t>
+      </w:r>
+    </w:p>
+    <w:p>
+      <w:pPr>
+        <w:rPr>
+          <w:lang w:val="vi-VN"/>
+        </w:rPr>
+      </w:pPr>
+    </w:p>
+    <w:p>
+      <w:pPr>
+        <w:rPr>
+          <w:lang w:val="vi-VN"/>
+        </w:rPr>
+      </w:pPr>
+      <w:r>
+        <w:rPr>
+          <w:lang w:val="vi-VN"/>
+        </w:rPr>
+        <w:t xml:space="preserve"> Thuộc tính video:</w:t>
+      </w:r>
+    </w:p>
+    <w:p>
+      <w:pPr>
+        <w:rPr>
+          <w:lang w:val="vi-VN"/>
+        </w:rPr>
+      </w:pPr>
+      <w:r>
+        <w:rPr>
+          <w:lang w:val="vi-VN"/>
+        </w:rPr>
+        <w:t>- FPS (Frames Per Second): Số khung hình/giây - quyết định độ mượt của video (24fps=phim, 30fps=TV, 60fps=game)</w:t>
+      </w:r>
+    </w:p>
+    <w:p>
+      <w:pPr>
+        <w:rPr>
+          <w:lang w:val="vi-VN"/>
+        </w:rPr>
+      </w:pPr>
+      <w:r>
+        <w:rPr>
+          <w:lang w:val="vi-VN"/>
+        </w:rPr>
+        <w:t>- FOURCC: Mã 4 ký tự định danh codec nén video (H264, XVID, MP4V...)</w:t>
+      </w:r>
+    </w:p>
+    <w:p>
+      <w:pPr>
+        <w:rPr>
+          <w:lang w:val="vi-VN"/>
+        </w:rPr>
+      </w:pPr>
+      <w:r>
+        <w:rPr>
+          <w:lang w:val="vi-VN"/>
+        </w:rPr>
+        <w:t>- frame_count: Tổng số khung hình trong video</w:t>
+      </w:r>
+    </w:p>
+    <w:p>
+      <w:pPr>
+        <w:rPr>
+          <w:lang w:val="vi-VN"/>
+        </w:rPr>
+      </w:pPr>
+      <w:r>
+        <w:rPr>
+          <w:lang w:val="vi-VN"/>
+        </w:rPr>
+        <w:t>- duration: Thời lượng video (giây) = frame_count ÷ FPS</w:t>
+      </w:r>
+    </w:p>
+    <w:p>
+      <w:pPr>
+        <w:rPr>
+          <w:lang w:val="vi-VN"/>
+        </w:rPr>
+      </w:pPr>
+      <w:r>
+        <w:rPr>
+          <w:lang w:val="vi-VN"/>
+        </w:rPr>
+        <w:t>- bitrate: Tốc độ dữ liệu (bit/giây) - cao hơn = chất lượng tốt hơn nhưng file nặng hơn</w:t>
+      </w:r>
+    </w:p>
+    <w:p>
+      <w:pPr>
+        <w:rPr>
+          <w:lang w:val="vi-VN"/>
+        </w:rPr>
+      </w:pPr>
+      <w:r>
+        <w:rPr>
+          <w:lang w:val="vi-VN"/>
+        </w:rPr>
+        <w:t>- codec: Thuật toán nén/giải nén video (H.264, H.265/HEVC...)</w:t>
+      </w:r>
+    </w:p>
+    <w:p>
+      <w:pPr>
+        <w:rPr>
+          <w:lang w:val="vi-VN"/>
+        </w:rPr>
+      </w:pPr>
+    </w:p>
+    <w:p>
+      <w:pPr>
+        <w:rPr>
+          <w:lang w:val="vi-VN"/>
+        </w:rPr>
+      </w:pPr>
+      <w:r>
+        <w:rPr>
+          <w:lang w:val="vi-VN"/>
+        </w:rPr>
+        <w:t>Lưu ý: Các thuộc tính này giúp tối ưu hóa xử lý, chọn format phù hợp và đánh giá chất lượng media.</w:t>
       </w:r>
     </w:p>
     <w:sectPr>
@@ -2818,7 +2408,7 @@
 </file>
 
 <file path=word/styles.xml><?xml version="1.0" encoding="utf-8"?>
-<w:styles xmlns:mc="http://schemas.openxmlformats.org/markup-compatibility/2006" xmlns:r="http://schemas.openxmlformats.org/officeDocument/2006/relationships" xmlns:w="http://schemas.openxmlformats.org/wordprocessingml/2006/main" xmlns:w14="http://schemas.microsoft.com/office/word/2010/wordml" xmlns:w15="http://schemas.microsoft.com/office/word/2012/wordml" xmlns:w16cex="http://schemas.microsoft.com/office/word/2018/wordml/cex" xmlns:w16cid="http://schemas.microsoft.com/office/word/2016/wordml/cid" xmlns:w16="http://schemas.microsoft.com/office/word/2018/wordml" xmlns:w16du="http://schemas.microsoft.com/office/word/2023/wordml/word16du" xmlns:w16sdtdh="http://schemas.microsoft.com/office/word/2020/wordml/sdtdatahash" xmlns:w16sdtfl="http://schemas.microsoft.com/office/word/2024/wordml/sdtformatlock" xmlns:w16se="http://schemas.microsoft.com/office/word/2015/wordml/symex" mc:Ignorable="w14 w15 w16se w16cid w16 w16cex w16sdtdh w16sdtfl w16du">
+<w:styles xmlns:mc="http://schemas.openxmlformats.org/markup-compatibility/2006" xmlns:r="http://schemas.openxmlformats.org/officeDocument/2006/relationships" xmlns:w="http://schemas.openxmlformats.org/wordprocessingml/2006/main" xmlns:w14="http://schemas.microsoft.com/office/word/2010/wordml" xmlns:w15="http://schemas.microsoft.com/office/word/2012/wordml" mc:Ignorable="w14 w15">
   <w:docDefaults>
     <w:rPrDefault>
       <w:rPr>
@@ -2836,7 +2426,7 @@
       </w:pPr>
     </w:pPrDefault>
   </w:docDefaults>
-  <w:latentStyles w:defLockedState="0" w:defUIPriority="99" w:defSemiHidden="0" w:defUnhideWhenUsed="0" w:defQFormat="0" w:count="376">
+  <w:latentStyles w:defLockedState="0" w:defUIPriority="99" w:defSemiHidden="0" w:defUnhideWhenUsed="0" w:defQFormat="0" w:count="371">
     <w:lsdException w:name="Normal" w:uiPriority="0" w:qFormat="1"/>
     <w:lsdException w:name="heading 1" w:uiPriority="9" w:qFormat="1"/>
     <w:lsdException w:name="heading 2" w:semiHidden="1" w:uiPriority="9" w:unhideWhenUsed="1" w:qFormat="1"/>
@@ -3208,11 +2798,6 @@
     <w:lsdException w:name="List Table 5 Dark Accent 6" w:uiPriority="50"/>
     <w:lsdException w:name="List Table 6 Colorful Accent 6" w:uiPriority="51"/>
     <w:lsdException w:name="List Table 7 Colorful Accent 6" w:uiPriority="52"/>
-    <w:lsdException w:name="Mention" w:semiHidden="1" w:unhideWhenUsed="1"/>
-    <w:lsdException w:name="Smart Hyperlink" w:semiHidden="1" w:unhideWhenUsed="1"/>
-    <w:lsdException w:name="Hashtag" w:semiHidden="1" w:unhideWhenUsed="1"/>
-    <w:lsdException w:name="Unresolved Mention" w:semiHidden="1" w:unhideWhenUsed="1"/>
-    <w:lsdException w:name="Smart Link" w:semiHidden="1" w:unhideWhenUsed="1"/>
   </w:latentStyles>
   <w:style w:type="paragraph" w:default="1" w:styleId="Normal">
     <w:name w:val="Normal"/>

</xml_diff>